<commit_message>
fix(revenus-passifs): corrige la leçon 08 et durcit le prompt (B4, C2, C3, E4)
Mailchimp lu, daté, lié, ajouté aux ressources (le défaut qui avait fait refuser le push) ;
exercice 1c au prix de renouvellement (seuil 3 → 5) ; challenge recalculé avec ses nombres
(2 ventes, pas « 3-4 ») ; tableau au taux annoncé (5,32 · 10,17), OVH +63 %. Journal, fiche.
Prompt : page décrite = page ouverte et page nommée = page liée avec le contrôle commun en
test ; prix promo ≠ base de calcul ; seuil recalculé ; arithmétique par commande.

Co-Authored-By: Claude Opus 5 <noreply@anthropic.com>
</commit_message>
<xml_diff>
--- a/livrables/lecons/2026-09-13_lecon-revenus-passifs_08_outils-creation-hebergement-paiement.docx
+++ b/livrables/lecons/2026-09-13_lecon-revenus-passifs_08_outils-creation-hebergement-paiement.docx
@@ -483,7 +483,7 @@
           <w:sz w:val="22"/>
           <w:szCs w:val="22"/>
         </w:rPr>
-        <w:t xml:space="preserve">OVH hébergement web : l'offre Starter est affichée à 1,59 € HT/mois en promotion (annuel), mais le prix de renouvellement est de 2,59 € HT/mois — soit 62 % de plus après la première année (source : ovhcloud.com/fr/web-hosting, lu le 13/09/2026).</w:t>
+        <w:t xml:space="preserve">OVH hébergement web : l'offre Starter est affichée à 1,59 € HT/mois en promotion (annuel), mais le prix de renouvellement est de 2,59 € HT/mois — soit 63 % de plus après la première année (2,59/1,59 = 1,629 — ⚠️ corrigé le 13/09/2026, la première version arrondissait à 62 %) (source : ovhcloud.com/fr/web-hosting, lu le 13/09/2026).</w:t>
       </w:r>
     </w:p>
     <w:p>
@@ -726,7 +726,7 @@
                 <w:sz w:val="20"/>
                 <w:szCs w:val="20"/>
               </w:rPr>
-              <w:t xml:space="preserve">5 % + 0,50 $ ≈ 5,35 €*</w:t>
+              <w:t xml:space="preserve">5 % + 0,50 $ ≈ 5,32 €*</w:t>
             </w:r>
           </w:p>
         </w:tc>
@@ -742,7 +742,7 @@
                 <w:sz w:val="20"/>
                 <w:szCs w:val="20"/>
               </w:rPr>
-              <w:t xml:space="preserve">≈ 91,65 €</w:t>
+              <w:t xml:space="preserve">≈ 91,68 €</w:t>
             </w:r>
           </w:p>
         </w:tc>
@@ -792,7 +792,7 @@
                 <w:sz w:val="20"/>
                 <w:szCs w:val="20"/>
               </w:rPr>
-              <w:t xml:space="preserve">10 % + 0,50 $ ≈ 10,20 €*</w:t>
+              <w:t xml:space="preserve">10 % + 0,50 $ ≈ 10,17 €*</w:t>
             </w:r>
           </w:p>
         </w:tc>
@@ -808,7 +808,7 @@
                 <w:sz w:val="20"/>
                 <w:szCs w:val="20"/>
               </w:rPr>
-              <w:t xml:space="preserve">≈ 86,80 €</w:t>
+              <w:t xml:space="preserve">≈ 86,83 €</w:t>
             </w:r>
           </w:p>
         </w:tc>
@@ -973,7 +973,7 @@
           <w:sz w:val="22"/>
           <w:szCs w:val="22"/>
         </w:rPr>
-        <w:t xml:space="preserve">* Les commissions LemonSqueezy et Gumroad sont en USD (0,50 $). Le montant converti en euros dépend du taux de change au moment de la transaction — ce tableau utilise 1 $ ≈ 0,93 € à titre illustratif.</w:t>
+        <w:t xml:space="preserve">* Les commissions LemonSqueezy et Gumroad sont en USD (0,50 $). Le montant converti en euros dépend du taux de change au moment de la transaction — ce tableau utilise 1 $ ≈ 0,93 € à titre illustratif, soit 0,47 € pour 0,50 $ (⚠️ corrigé le 13/09/2026 : la première version annonçait 0,93 et calculait avec 0,50 € — 5,35 et 10,20 au lieu de 5,32 et 10,17).</w:t>
       </w:r>
     </w:p>
     <w:p>
@@ -1032,7 +1032,28 @@
           <w:sz w:val="22"/>
           <w:szCs w:val="22"/>
         </w:rPr>
-        <w:t xml:space="preserve">Pour Mailchimp, les plans sont similaires (Free, Essentials, Standard, Premium). Les prix exacts varient selon le nombre de contacts et la périodicité de facturation. Donnée de prix non lue sur la page lors de cette exécution — vérifier directement sur mailchimp.com/pricing.</w:t>
+        <w:t xml:space="preserve">Pour Mailchimp, les plans sont similaires : Gratuit, Essentials, Standard, Premium — lus sur </w:t>
+      </w:r>
+      <w:hyperlink w:history="1" r:id="rIdmailchimp2026">
+        <w:r>
+          <w:rPr>
+            <w:rFonts w:ascii="Times New Roman" w:cs="Times New Roman" w:eastAsia="Times New Roman" w:hAnsi="Times New Roman"/>
+            <w:sz w:val="22"/>
+            <w:szCs w:val="22"/>
+            <w:color w:val="1155CC"/>
+            <w:u w:val="single"/>
+          </w:rPr>
+          <w:t xml:space="preserve">mailchimp.com/pricing</w:t>
+        </w:r>
+      </w:hyperlink>
+      <w:r>
+        <w:rPr>
+          <w:rFonts w:ascii="Times New Roman" w:cs="Times New Roman" w:eastAsia="Times New Roman" w:hAnsi="Times New Roman"/>
+          <w:color w:val="1F2937"/>
+          <w:sz w:val="22"/>
+          <w:szCs w:val="22"/>
+        </w:rPr>
+        <w:t xml:space="preserve"> le 13/09/2026. Les prix exacts varient selon le nombre de contacts et la périodicité de facturation ; ils ne sont pas repris ici. ⚠️ Corrigé le 13/09/2026 : la première version décrivait ces quatre plans comme « non lus sur la page lors de cette exécution » — de mémoire, donc — et nommait la page sans la lier ; elle répond 200 et 38 230 caractères utiles à un navigateur, et porte bien les quatre plans.</w:t>
       </w:r>
     </w:p>
     <w:p>
@@ -1196,7 +1217,7 @@
           <w:sz w:val="22"/>
           <w:szCs w:val="22"/>
         </w:rPr>
-        <w:t xml:space="preserve">c) Dès quel nombre de ventes par mois Stripe devient-il plus rentable que LemonSqueezy, si tu paies en plus un hébergement OVH Perso à 2,99 €/mois (tarif promo annuel, source : ovhcloud.com/fr/web-hosting) ?</w:t>
+        <w:t xml:space="preserve">c) Dès quel nombre de ventes par mois Stripe devient-il plus rentable que LemonSqueezy, si tu paies en plus un hébergement OVH Perso à 2,99 €/mois la première année (tarif promo annuel) puis 5,99 €/mois au renouvellement (source : ovhcloud.com/fr/web-hosting) ?</w:t>
       </w:r>
     </w:p>
     <w:p>
@@ -1239,9 +1260,9 @@
 c) LemonSqueezy sur 29 € : 5 % + ~0,47 € = 1,45 + 0,47 = ~1,92 €. Tu gardes ~27,08 €.
    Stripe sur 29 € : ~0,69 € de frais. Tu gardes ~28,32 €.
    Différence par vente : 28,32 – 27,08 = 1,24 € en faveur de Stripe.
-   Coût mensuel fixe OVH Perso : 2,99 € HT.
-   Nombre de ventes minimum pour rentabiliser l'hébergement : 2,99 / 1,24 ≈ 2,4 → dès 3 ventes/mois, Stripe+OVH est plus rentable.
-   Lecture : à partir de 3 ventes d'ebook à 29 € par mois, avoir son propre hébergement avec Stripe revient moins cher que LemonSqueezy seul.</w:t>
+   Coût mensuel fixe OVH Perso : 2,99 € HT la première année, 5,99 € HT ensuite.
+   Nombre de ventes minimum pour rentabiliser l'hébergement : 2,99 / 1,24 ≈ 2,4 → 3 ventes/mois la première année ; 5,99 / 1,24 ≈ 4,8 → 5 ventes/mois au prix de renouvellement. ⚠️ Corrigé le 13/09/2026 : la première version calculait avec le seul prix promo et concluait « dès 3 ventes », deux paragraphes après avoir expliqué que le prix réel est celui du renouvellement.
+   Lecture : à partir de 5 ventes d'ebook à 29 € par mois (3 la première année, au tarif promo), avoir son propre hébergement avec Stripe revient moins cher que LemonSqueezy seul.</w:t>
       </w:r>
     </w:p>
     <w:p>
@@ -2045,8 +2066,8 @@
         <w:t xml:space="preserve">Projet : ebook de recettes végétales à 19 €.
 Démarrage (0 vente) : Gumroad gratuit = 0 €/mois. Pas d'hébergement nécessaire.
 20 ventes/mois : 20 × (10 % + 0,50 $) ≈ 20 × 2,37 € = ~47,40 € de commissions prélevées.
-100 ventes/mois : 100 × 2,37 € = ~237 €. Coût OVH+Stripe serait : 2,99 € + 100 × 0,535 € = ~56,5 €.
-→ Seuil de bascule Gumroad → Stripe+OVH : autour de 3-4 ventes/mois (comme calculé en exercice 1).
+100 ventes/mois : 100 × 2,37 € = ~237 €. Coût OVH+Stripe serait : 2,99 € + 100 × 0,535 € = ~56,5 € (5,99 € + 53,5 € = ~59,5 € au prix de renouvellement).
+→ Seuil de bascule Gumroad → Stripe+OVH : l'économie par vente est de 2,37 − 0,535 = 1,835 € ; 2,99 / 1,835 ≈ 1,6 → dès 2 ventes/mois la première année, 5,99 / 1,835 ≈ 3,3 → dès 4 ventes au renouvellement. ⚠️ Corrigé le 13/09/2026 : la première version écrivait « autour de 3-4 ventes/mois (comme calculé en exercice 1) » — l'exercice 1 portait sur un autre prix (29 €) et une autre plateforme (LemonSqueezy) ; avec les nombres du challenge, le seuil est 2, pas 3.
 Risque n°1 : pas de liste email propre ; si Gumroad ferme le compte, les acheteurs passés sont perdus.</w:t>
       </w:r>
     </w:p>
@@ -2286,6 +2307,28 @@
     </w:p>
     <w:p>
       <w:pPr>
+        <w:pStyle w:val="ListParagraph"/>
+        <w:numPr>
+          <w:ilvl w:val="0"/>
+          <w:numId w:val="1"/>
+        </w:numPr>
+        <w:spacing w:after="60" w:before="60"/>
+      </w:pPr>
+      <w:hyperlink w:history="1" r:id="rIdmailchimp2026">
+        <w:r>
+          <w:rPr>
+            <w:rFonts w:ascii="Times New Roman" w:cs="Times New Roman" w:eastAsia="Times New Roman" w:hAnsi="Times New Roman"/>
+            <w:color w:val="1155CC"/>
+            <w:sz w:val="22"/>
+            <w:szCs w:val="22"/>
+            <w:u w:val="single" w:color="1155CC"/>
+          </w:rPr>
+          <w:t xml:space="preserve">Mailchimp — Tarifs (Gratuit, Essentials, Standard, Premium ; prix selon le nombre de contacts et la périodicité — ajoutée le 13/09/2026, la page était nommée sans lien)</w:t>
+        </w:r>
+      </w:hyperlink>
+    </w:p>
+    <w:p>
+      <w:pPr>
         <w:spacing w:after="100" w:before="100"/>
       </w:pPr>
     </w:p>
@@ -2324,6 +2367,92 @@
       <w:pPr>
         <w:spacing w:after="100" w:before="100"/>
       </w:pPr>
+    </w:p>
+    <w:p>
+      <w:pPr>
+        <w:spacing w:after="120" w:before="320"/>
+      </w:pPr>
+      <w:r>
+        <w:rPr>
+          <w:rFonts w:ascii="Times New Roman" w:cs="Times New Roman" w:eastAsia="Times New Roman" w:hAnsi="Times New Roman"/>
+          <w:b/>
+          <w:bCs/>
+          <w:color w:val="1B3A6B"/>
+          <w:sz w:val="28"/>
+          <w:szCs w:val="28"/>
+        </w:rPr>
+        <w:t xml:space="preserve">📝 Journal des corrections — 12 septembre 2026</w:t>
+      </w:r>
+    </w:p>
+    <w:p>
+      <w:pPr>
+        <w:spacing w:after="80"/>
+      </w:pPr>
+      <w:r>
+        <w:rPr>
+          <w:rFonts w:ascii="Times New Roman" w:cs="Times New Roman" w:eastAsia="Times New Roman" w:hAnsi="Times New Roman"/>
+          <w:color w:val="1F2937"/>
+          <w:sz w:val="22"/>
+          <w:szCs w:val="22"/>
+        </w:rPr>
+        <w:t xml:space="preserve">Leçon produite le 13/09/2026 à 7h03, relue le jour même. Quatre corrections ; aucun tarif n'était faux — les neuf pages de prix ont été rouvertes, chaque chiffre y est.</w:t>
+      </w:r>
+    </w:p>
+    <w:p>
+      <w:pPr>
+        <w:spacing w:after="80"/>
+      </w:pPr>
+      <w:r>
+        <w:rPr>
+          <w:rFonts w:ascii="Times New Roman" w:cs="Times New Roman" w:eastAsia="Times New Roman" w:hAnsi="Times New Roman"/>
+          <w:color w:val="1F2937"/>
+          <w:sz w:val="22"/>
+          <w:szCs w:val="22"/>
+        </w:rPr>
+        <w:t xml:space="preserve">① Mailchimp décrit sans avoir été lu, et nommé sans lien. « Les plans sont similaires (Free, Essentials, Standard, Premium)… Donnée de prix non lue sur la page lors de cette exécution — vérifier directement sur mailchimp.com/pricing. » La page répond 200 et 38 230 caractères utiles à un navigateur et porte les quatre plans : la description était juste, mais venait de la mémoire du modèle. C'est ce défaut qui a retenu la leçon : le contrôle pre-push du dépôt a refusé la publication (1 page nommée, absente des ressources), et la veille iMac du même matin avec elle. Page lue, datée, liée, ajoutée aux ressources.</w:t>
+      </w:r>
+    </w:p>
+    <w:p>
+      <w:pPr>
+        <w:spacing w:after="80"/>
+      </w:pPr>
+      <w:r>
+        <w:rPr>
+          <w:rFonts w:ascii="Times New Roman" w:cs="Times New Roman" w:eastAsia="Times New Roman" w:hAnsi="Times New Roman"/>
+          <w:color w:val="1F2937"/>
+          <w:sz w:val="22"/>
+          <w:szCs w:val="22"/>
+        </w:rPr>
+        <w:t xml:space="preserve">② L'exercice 1c calculait le seuil de rentabilité avec OVH Perso à 2,99 € — le prix promotionnel de la première année — deux paragraphes après que la leçon eut expliqué que le prix réel est celui du renouvellement, 5,99 €. Version initiale : « 2,99 / 1,24 ≈ 2,4 → dès 3 ventes/mois ». Le seuil au prix de renouvellement est 5 (5,99 / 1,24 = 4,83). Les deux figurent désormais.</w:t>
+      </w:r>
+    </w:p>
+    <w:p>
+      <w:pPr>
+        <w:spacing w:after="80"/>
+      </w:pPr>
+      <w:r>
+        <w:rPr>
+          <w:rFonts w:ascii="Times New Roman" w:cs="Times New Roman" w:eastAsia="Times New Roman" w:hAnsi="Times New Roman"/>
+          <w:color w:val="1F2937"/>
+          <w:sz w:val="22"/>
+          <w:szCs w:val="22"/>
+        </w:rPr>
+        <w:t xml:space="preserve">③ Le challenge annonçait un « seuil de bascule Gumroad → Stripe+OVH autour de 3-4 ventes/mois (comme calculé en exercice 1) ». L'exercice 1 portait sur un ebook à 29 € face à LemonSqueezy ; le challenge porte sur 19 € face à Gumroad. Avec ses propres nombres — 2,37 € de commission Gumroad contre 0,535 € de frais Stripe — l'économie est de 1,835 € par vente et le seuil de 2 ventes en promo, 4 au renouvellement. Recalculé et écrit.</w:t>
+      </w:r>
+    </w:p>
+    <w:p>
+      <w:pPr>
+        <w:spacing w:after="80"/>
+      </w:pPr>
+      <w:r>
+        <w:rPr>
+          <w:rFonts w:ascii="Times New Roman" w:cs="Times New Roman" w:eastAsia="Times New Roman" w:hAnsi="Times New Roman"/>
+          <w:color w:val="1F2937"/>
+          <w:sz w:val="22"/>
+          <w:szCs w:val="22"/>
+        </w:rPr>
+        <w:t xml:space="preserve">④ Le tableau des commissions sur 97 € annonçait en note « 1 $ ≈ 0,93 € » et calculait avec 0,50 € : LemonSqueezy 5,35 € (pour 5,32), Gumroad 10,20 € (pour 10,17), et les montants gardés en conséquence — trois centimes, mais la note et les chiffres se contredisaient, alors que l'exercice 1 appliquait bien 0,47 €. Et OVH « +62 % » est +63 % (2,59/1,59 = 1,629). Vérifié et inchangé : Stripe 1,71 → 95,29 ; Discover 29,10 → 67,90 ; exercice 1 (25,63 · 28,32 · 27,08) ; challenge (47,40 · 237 · 56,49).</w:t>
+      </w:r>
     </w:p>
     <w:sectPr>
       <w:pgSz w:w="11906" w:h="16838" w:orient="portrait"/>

</xml_diff>